<commit_message>
Link Kelana to Khairul (Ch6/7), make father a teacher in Ch32, fix Ch28 first-contact memory
Co-Authored-By: Claude Sonnet 5.5 <noreply@anthropic.com>

Claude-Session: https://claude.ai/code/session_011sBVAmX35tPxqRASXqkfKn
</commit_message>
<xml_diff>
--- a/01_The_Blue_Silence/Manuscript/THE_BLUE_SILENCE_Chapter_06_The_Border.docx
+++ b/01_The_Blue_Silence/Manuscript/THE_BLUE_SILENCE_Chapter_06_The_Border.docx
@@ -4386,6 +4386,30 @@
       </w:pPr>
       <w:r>
         <w:t>Muhammad Khairul gave the least useful statement Rahman had ever taken.</w:t>
+      </w:r>
+    </w:p>
+    <w:p>
+      <w:pPr>
+        <w:jc w:val="left"/>
+      </w:pPr>
+      <w:r>
+        <w:t>The arrest sheet said Muhammad Khairul.</w:t>
+      </w:r>
+    </w:p>
+    <w:p>
+      <w:pPr>
+        <w:jc w:val="left"/>
+      </w:pPr>
+      <w:r>
+        <w:t>Every officer at the border post called him something else.</w:t>
+      </w:r>
+    </w:p>
+    <w:p>
+      <w:pPr>
+        <w:jc w:val="left"/>
+      </w:pPr>
+      <w:r>
+        <w:t>Kelana. The wanderer. He had earned it by never being where the last report put him.</w:t>
       </w:r>
     </w:p>
     <w:p>

</xml_diff>